<commit_message>
Harvest thermal fields course framing
</commit_message>
<xml_diff>
--- a/dcp/DCP_ARCH7XXX_Draft_HGuo_Jun23_2026.docx
+++ b/dcp/DCP_ARCH7XXX_Draft_HGuo_Jun23_2026.docx
@@ -97,7 +97,7 @@
         <w:pStyle w:val="FirstParagraph"/>
       </w:pPr>
       <w:r>
-        <w:t xml:space="preserve">This elective introduces thermal environments as spatial, temporal, radiant, and human-centered fields that architects can read, test, and transform. Rather than treating comfort as a single indoor setpoint, students learn to interpret air temperature, humidity, surface temperature, mean radiant temperature, air movement, thermal capacity, accumulated exposure, weather sequences, and occupant variability as architectural design questions.</w:t>
+        <w:t xml:space="preserve">This course examines thermal environments as spatial, temporal, and human-centered phenomena in architectural design. Moving beyond average air temperature and static comfort targets, students investigate radiant environment, heat transfer, indoor/outdoor heterogeneity, climate stress, and uncertainty in measurement and simulation. Through field evidence, numerical analysis, EnergyPlus-based or EnergyPlus-derived workflows, thermal mapping, and design testing, students learn to diagnose when and how buildings fail thermally and to translate that diagnosis into architectural interventions involving envelope, shading, material, ventilation, program, landscape, and user control. The course emphasizes measurable design reasoning, climate adaptation, health and welfare, and the limits of evidence-based claims.</w:t>
       </w:r>
     </w:p>
     <w:p>
@@ -105,7 +105,7 @@
         <w:pStyle w:val="BodyText"/>
       </w:pPr>
       <w:r>
-        <w:t xml:space="preserve">The course is scientifically rigorous and architecturally situated. Each technical idea is tied to a spatial consequence: a perimeter seat, shaded threshold, roof-exposed room, courtyard, glass facade, pavement surface, ventilated section, or thermal refuge. Students learn portable thermodynamic and building-physics concepts through diagrams, field evidence, sensing protocols, simple calculations, simulation outputs, and design-action tests. The aim is not to train students as thermal engineers or HVAC specialists. The aim is to develop thermal intelligence: the ability to see where thermal conditions vary, why they vary, what evidence can or cannot prove, and how design decisions alter exposure, comfort, risk, and environmental legibility.</w:t>
+        <w:t xml:space="preserve">Thermal design is not the pursuit of one average indoor condition. It is the shaping of heterogeneous thermal environments across bodies, surfaces, rooms, buildings, and climates under uncertainty. Students learn to map thermal variation, stress-test buildings against assumptions and climate scenarios, identify failure modes hidden by averages or compliance metrics, and translate evidence into architectural interventions.</w:t>
       </w:r>
     </w:p>
     <w:p>

</xml_diff>

<commit_message>
Add moisture and heterogeneity action thread
</commit_message>
<xml_diff>
--- a/dcp/DCP_ARCH7XXX_Draft_HGuo_Jun23_2026.docx
+++ b/dcp/DCP_ARCH7XXX_Draft_HGuo_Jun23_2026.docx
@@ -791,7 +791,7 @@
               <w:pStyle w:val="Compact"/>
             </w:pPr>
             <w:r>
-              <w:t xml:space="preserve">Course framing; why one air-temperature value cannot define a thermal condition; Ta/RH, air speed, stagnant air, humidity stress, ventilation context, point-to-field mapping, psychrometric thinking, hidden defaults. Diagnostic round: thermal claim autopsy from a studio or precedent image.</w:t>
+              <w:t xml:space="preserve">Course framing; why one air-temperature value cannot define a thermal condition; Ta/RH, air speed, stagnant air, humidity stress, ventilation context, point-to-field mapping, psychrometric thinking, moisture action ladder preview, hidden defaults. Diagnostic round: thermal claim autopsy from a studio or precedent image.</w:t>
             </w:r>
           </w:p>
         </w:tc>
@@ -848,7 +848,7 @@
               <w:pStyle w:val="Compact"/>
             </w:pPr>
             <w:r>
-              <w:t xml:space="preserve">How a body exchanges heat with a space; metabolism, clothing, convection, draft/breeze, radiation, evaporation, dehumidification, PMV/PPD, adaptive comfort, UTCI, WBGT, and heat-index concepts as models with domains and limits. Diagnostic round: identify dominant heat-exchange pathway and competing design constraints.</w:t>
+              <w:t xml:space="preserve">How a body exchanges heat with a space; metabolism, clothing, convection, draft/breeze, radiation, evaporation, dehumidification, heat-stress pathways, PMV/PPD, adaptive comfort, UTCI, WBGT, and heat-index concepts as models with domains and limits. Diagnostic round: identify dominant heat-exchange pathway and competing design constraints.</w:t>
             </w:r>
           </w:p>
         </w:tc>
@@ -905,7 +905,7 @@
               <w:pStyle w:val="Compact"/>
             </w:pPr>
             <w:r>
-              <w:t xml:space="preserve">What sensing can prove; sensor placement, logging interval, sampling bias, interpolation, point maps, contour/heat maps, air-movement observation, surface readings, radiant proxy options, ventilation versus local exposure, privacy and field ethics. Diagnostic round: where would you measure, and what would the sensor miss?</w:t>
+              <w:t xml:space="preserve">What sensing can prove; sensor placement, logging interval, sampling bias, interpolation, point maps, contour/heat maps, RH/Ta capture limits, air-movement observation, surface readings, radiant proxy options, ventilation versus local exposure, privacy and field ethics. Diagnostic round: where would you measure, and what would the sensor miss?</w:t>
             </w:r>
           </w:p>
         </w:tc>
@@ -1076,7 +1076,7 @@
               <w:pStyle w:val="Compact"/>
             </w:pPr>
             <w:r>
-              <w:t xml:space="preserve">Heat capacity, thermal lag, storage, degree-hours, thresholds, moisture accumulation, and why failure can be cumulative. Includes anonymous Week 6 course-alignment pulse check. Diagnostic round: identify when heat or moisture accumulates.</w:t>
+              <w:t xml:space="preserve">Heat capacity, thermal lag, storage, degree-hours, thresholds, condensation, mold risk, material moisture storage, and why failure can be cumulative. Includes anonymous Week 6 course-alignment pulse check. Diagnostic round: identify when heat or moisture accumulates.</w:t>
             </w:r>
           </w:p>
         </w:tc>
@@ -1116,7 +1116,7 @@
               <w:t xml:space="preserve">C dT/dt = gains - losses</w:t>
             </w:r>
             <w:r>
-              <w:t xml:space="preserve">, degree-hours, thresholds.</w:t>
+              <w:t xml:space="preserve">, degree-hours, thresholds, material moisture.</w:t>
             </w:r>
           </w:p>
         </w:tc>
@@ -1322,7 +1322,7 @@
               <w:pStyle w:val="Compact"/>
             </w:pPr>
             <w:r>
-              <w:t xml:space="preserve">Failure types and pivot logic: average, spatial, radiant, temporal, occupant, weather, model, or action-grid failure. Diagnostic round: which architectural element must change, and what tradeoff appears?</w:t>
+              <w:t xml:space="preserve">Failure types and pivot logic: average, spatial, radiant, temporal, occupant, weather, model, or action-grid failure. Introduces suppress, buffer, redirect, and celebrate as four postures toward thermal heterogeneity. Diagnostic round: which architectural element must change, and what tradeoff appears?</w:t>
             </w:r>
           </w:p>
         </w:tc>
@@ -1344,7 +1344,7 @@
               <w:pStyle w:val="Compact"/>
             </w:pPr>
             <w:r>
-              <w:t xml:space="preserve">Failure thresholds, tradeoffs, design action alternatives, future-proofing implication.</w:t>
+              <w:t xml:space="preserve">Failure thresholds, tradeoffs, design action alternatives, intervention posture, future-proofing implication.</w:t>
             </w:r>
           </w:p>
         </w:tc>
@@ -1992,6 +1992,14 @@
       </w:pPr>
       <w:r>
         <w:t xml:space="preserve">Every A4 submission must include one roll-forward validation note. The required version changes one stress assumption, such as hotter week, heatwave period, changed occupancy, changed window/glazing assumption, current versus future-adjusted weather, or different stress-window length. Students label the outcome as robust, weakened, censored, or unsupported. Multi-window or multi-weather reruns are encouraged for distinction-level work when they improve architectural judgment, but they are not required for basic completion.</w:t>
+      </w:r>
+    </w:p>
+    <w:p>
+      <w:pPr>
+        <w:pStyle w:val="BodyText"/>
+      </w:pPr>
+      <w:r>
+        <w:t xml:space="preserve">The A4 action does not need to flatten all thermal difference. Students may suppress a harmful heterogeneity, buffer or redirect exposure, or deliberately celebrate a beneficial heterogeneity such as a cool refuge, breezy threshold, warm winter seat, or shaded humid garden edge. In all cases, the mechanism, body consequence, evidence limit, and climate-stress risk must be stated.</w:t>
       </w:r>
     </w:p>
     <w:bookmarkEnd w:id="27"/>

</xml_diff>

<commit_message>
Add A3 boundary and climate snapshot framing
</commit_message>
<xml_diff>
--- a/dcp/DCP_ARCH7XXX_Draft_HGuo_Jun23_2026.docx
+++ b/dcp/DCP_ARCH7XXX_Draft_HGuo_Jun23_2026.docx
@@ -1151,29 +1151,29 @@
               <w:pStyle w:val="Compact"/>
             </w:pPr>
             <w:r>
-              <w:t xml:space="preserve">What simulation outputs are and are not; using EnergyPlus or prepared outputs to inspect hourly Ta, RH, MRT, operative temperature, surface temperature, and loads without treating the model as truth. Introduces airflow-network and CFD/Navier-Stokes solver literacy for claims about local air movement. Diagnostic round: what output would confirm or falsify the claim?</w:t>
-            </w:r>
-          </w:p>
-        </w:tc>
-        <w:tc>
-          <w:tcPr/>
-          <w:p>
-            <w:pPr>
-              <w:pStyle w:val="Compact"/>
-            </w:pPr>
-            <w:r>
-              <w:t xml:space="preserve">Build an hourly state log or precomputed-output analysis for A3.</w:t>
-            </w:r>
-          </w:p>
-        </w:tc>
-        <w:tc>
-          <w:tcPr/>
-          <w:p>
-            <w:pPr>
-              <w:pStyle w:val="Compact"/>
-            </w:pPr>
-            <w:r>
-              <w:t xml:space="preserve">EnergyPlus outputs, weather file, zone variables, model assumptions, airflow-network/CFD distinction, output inspection.</w:t>
+              <w:t xml:space="preserve">What simulation outputs are and are not; using EnergyPlus or prepared outputs to inspect hourly Ta, RH, MRT, operative temperature, surface temperature, and loads without treating the model as truth. Students draw the A3 system boundary box: spatial boundary, temporal window, climate snapshot, service state, and evidence limits. Introduces airflow-network and CFD/Navier-Stokes solver literacy for claims about local air movement. Diagnostic round: what output would confirm or falsify the claim?</w:t>
+            </w:r>
+          </w:p>
+        </w:tc>
+        <w:tc>
+          <w:tcPr/>
+          <w:p>
+            <w:pPr>
+              <w:pStyle w:val="Compact"/>
+            </w:pPr>
+            <w:r>
+              <w:t xml:space="preserve">Build an hourly state log or precomputed-output analysis for A3, with a declared system boundary.</w:t>
+            </w:r>
+          </w:p>
+        </w:tc>
+        <w:tc>
+          <w:tcPr/>
+          <w:p>
+            <w:pPr>
+              <w:pStyle w:val="Compact"/>
+            </w:pPr>
+            <w:r>
+              <w:t xml:space="preserve">EnergyPlus outputs, weather file, zone variables, system boundary, model assumptions, airflow-network/CFD distinction, output inspection.</w:t>
             </w:r>
           </w:p>
         </w:tc>
@@ -1208,29 +1208,29 @@
               <w:pStyle w:val="Compact"/>
             </w:pPr>
             <w:r>
-              <w:t xml:space="preserve">Weather files, typical year versus heatwave period, future weather, GCM/RCM concepts, stress windows, indoor/outdoor continuity. Diagnostic round: how would the design behave under a different weather slice?</w:t>
-            </w:r>
-          </w:p>
-        </w:tc>
-        <w:tc>
-          <w:tcPr/>
-          <w:p>
-            <w:pPr>
-              <w:pStyle w:val="Compact"/>
-            </w:pPr>
-            <w:r>
-              <w:t xml:space="preserve">Compare baseline temporal pattern against one changed weather or stress assumption.</w:t>
-            </w:r>
-          </w:p>
-        </w:tc>
-        <w:tc>
-          <w:tcPr/>
-          <w:p>
-            <w:pPr>
-              <w:pStyle w:val="Compact"/>
-            </w:pPr>
-            <w:r>
-              <w:t xml:space="preserve">EPW/TMY, heatwave windows, future weather, GCM/RCM, climate-stress reading.</w:t>
+              <w:t xml:space="preserve">Weather files, typical year versus heatwave period, future weather, GCM/RCM/WRF concepts, spatial resolution, stress windows, climate-zone drift, and indoor/outdoor continuity. Diagnostic round: how would the design behave under a different weather slice or climate snapshot?</w:t>
+            </w:r>
+          </w:p>
+        </w:tc>
+        <w:tc>
+          <w:tcPr/>
+          <w:p>
+            <w:pPr>
+              <w:pStyle w:val="Compact"/>
+            </w:pPr>
+            <w:r>
+              <w:t xml:space="preserve">Compare baseline temporal pattern against one changed weather, exposure, or climate assumption.</w:t>
+            </w:r>
+          </w:p>
+        </w:tc>
+        <w:tc>
+          <w:tcPr/>
+          <w:p>
+            <w:pPr>
+              <w:pStyle w:val="Compact"/>
+            </w:pPr>
+            <w:r>
+              <w:t xml:space="preserve">EPW/TMY, heatwave windows, future weather, GCM/RCM/WRF, spatial resolution, climate-zone drift, climate-stress reading.</w:t>
             </w:r>
           </w:p>
         </w:tc>
@@ -1868,7 +1868,7 @@
               <w:pStyle w:val="Compact"/>
             </w:pPr>
             <w:r>
-              <w:t xml:space="preserve">Time-series or hourly output; selected threshold; degree-hour or exceedance calculation; failure statement; explanation of thermal capacity, lag, moisture, or exposure duration.</w:t>
+              <w:t xml:space="preserve">Time-series or hourly output; system boundary box; selected threshold; degree-hour or exceedance calculation; baseline and changed weather/exposure/climate snapshot; failure statement; explanation of thermal capacity, lag, moisture, or exposure duration.</w:t>
             </w:r>
           </w:p>
         </w:tc>

</xml_diff>

<commit_message>
Sharpen A2 radiant source sink framing
</commit_message>
<xml_diff>
--- a/dcp/DCP_ARCH7XXX_Draft_HGuo_Jun23_2026.docx
+++ b/dcp/DCP_ARCH7XXX_Draft_HGuo_Jun23_2026.docx
@@ -962,7 +962,7 @@
               <w:pStyle w:val="Compact"/>
             </w:pPr>
             <w:r>
-              <w:t xml:space="preserve">Why same air temperature can produce different thermal experience; surface temperature, solar exposure, longwave/shortwave radiation, MRT, operative temperature, shade as architecture. Diagnostic round: locate radiant hot/cold positions.</w:t>
+              <w:t xml:space="preserve">Why same air temperature can produce different thermal experience; solar wattage, sky/surface source-sink logic, surface temperature, solar exposure, longwave/shortwave radiation, MRT, operative temperature, shade as architecture. Diagnostic round: locate radiant hot/cold positions.</w:t>
             </w:r>
           </w:p>
         </w:tc>
@@ -984,7 +984,7 @@
               <w:pStyle w:val="Compact"/>
             </w:pPr>
             <w:r>
-              <w:t xml:space="preserve">Surface temperature, MRT, operative temperature, indoor/outdoor radiant fields.</w:t>
+              <w:t xml:space="preserve">Solar and sky radiation, surface temperature, MRT, operative temperature, indoor/outdoor radiant fields.</w:t>
             </w:r>
           </w:p>
         </w:tc>
@@ -1019,29 +1019,29 @@
               <w:pStyle w:val="Compact"/>
             </w:pPr>
             <w:r>
-              <w:t xml:space="preserve">How body geometry, orientation, view factors, glass, shade, pavement, and facade depth deliver uneven radiant flux. Diagnostic round: assess whether the design mitigation changes the actual exposure pathway.</w:t>
-            </w:r>
-          </w:p>
-        </w:tc>
-        <w:tc>
-          <w:tcPr/>
-          <w:p>
-            <w:pPr>
-              <w:pStyle w:val="Compact"/>
-            </w:pPr>
-            <w:r>
-              <w:t xml:space="preserve">Submit A2 radiant exchange card with two-position comparison, body orientation, and design implication.</w:t>
-            </w:r>
-          </w:p>
-        </w:tc>
-        <w:tc>
-          <w:tcPr/>
-          <w:p>
-            <w:pPr>
-              <w:pStyle w:val="Compact"/>
-            </w:pPr>
-            <w:r>
-              <w:t xml:space="preserve">View factor logic, radiant asymmetry, flux delivery, facade and shade design.</w:t>
+              <w:t xml:space="preserve">How body geometry, orientation, view factors, glass, shade, pavement, indoor daytime variation, night-sky cooling, urban heat-island recovery, and facade depth deliver uneven radiant flux. Diagnostic round: assess whether the design mitigation changes the actual exposure pathway.</w:t>
+            </w:r>
+          </w:p>
+        </w:tc>
+        <w:tc>
+          <w:tcPr/>
+          <w:p>
+            <w:pPr>
+              <w:pStyle w:val="Compact"/>
+            </w:pPr>
+            <w:r>
+              <w:t xml:space="preserve">Submit A2 radiant exchange card with two-position comparison, body orientation, source/sink note, and design implication.</w:t>
+            </w:r>
+          </w:p>
+        </w:tc>
+        <w:tc>
+          <w:tcPr/>
+          <w:p>
+            <w:pPr>
+              <w:pStyle w:val="Compact"/>
+            </w:pPr>
+            <w:r>
+              <w:t xml:space="preserve">View factor logic, radiant asymmetry, flux delivery, facade and shade design, surface-temperature strategy.</w:t>
             </w:r>
           </w:p>
         </w:tc>
@@ -1821,7 +1821,7 @@
               <w:pStyle w:val="Compact"/>
             </w:pPr>
             <w:r>
-              <w:t xml:space="preserve">Two-position radiant comparison; body orientation; relevant surface temperatures or radiant proxy; air-versus-radiant distinction; one architectural implication.</w:t>
+              <w:t xml:space="preserve">Two-position radiant comparison; body orientation; relevant surface temperatures or radiant proxy; dominant source/sink note using solar wattage, surface temperature, MRT difference, or operative-temperature contribution where possible; air-versus-radiant distinction; one architectural implication.</w:t>
             </w:r>
           </w:p>
         </w:tc>

</xml_diff>

<commit_message>
Add LCZ IAQ and material property concepts
</commit_message>
<xml_diff>
--- a/dcp/DCP_ARCH7XXX_Draft_HGuo_Jun23_2026.docx
+++ b/dcp/DCP_ARCH7XXX_Draft_HGuo_Jun23_2026.docx
@@ -553,7 +553,7 @@
               <w:pStyle w:val="Compact"/>
             </w:pPr>
             <w:r>
-              <w:t xml:space="preserve">Students learn core thermal concepts: air temperature, relative humidity, psychrometric stress, heat balance, conduction, convection, radiation, evaporation, mean radiant temperature, operative temperature, thermal capacity, lag, exposure duration, and thresholds.</w:t>
+              <w:t xml:space="preserve">Students learn core thermal concepts: air temperature, relative humidity, psychrometric stress, heat balance, conduction, convection, radiation, evaporation, reflectivity/albedo, absorptivity, emissivity, mean radiant temperature, operative temperature, thermal capacity, lag, exposure duration, and thresholds.</w:t>
             </w:r>
           </w:p>
         </w:tc>
@@ -905,7 +905,7 @@
               <w:pStyle w:val="Compact"/>
             </w:pPr>
             <w:r>
-              <w:t xml:space="preserve">What sensing can prove; sensor placement, logging interval, sampling bias, interpolation, point maps, contour/heat maps, RH/Ta capture limits, air-movement observation, surface readings, radiant proxy options, ventilation versus local exposure, privacy and field ethics. Diagnostic round: where would you measure, and what would the sensor miss?</w:t>
+              <w:t xml:space="preserve">What sensing can prove; sensor placement, logging interval, sampling bias, interpolation, point maps, contour/heat maps, RH/Ta capture limits, air-movement observation, CO2/IAQ as competing air claim, surface readings, radiant proxy options, ventilation versus local exposure, privacy and field ethics. Diagnostic round: where would you measure, and what would the sensor miss?</w:t>
             </w:r>
           </w:p>
         </w:tc>
@@ -927,7 +927,7 @@
               <w:pStyle w:val="Compact"/>
             </w:pPr>
             <w:r>
-              <w:t xml:space="preserve">Air/RH loggers, point maps, contour/heat maps, air-movement observation, surface temperature, optional globe/SMART-style radiant proxy, sampling bias.</w:t>
+              <w:t xml:space="preserve">Air/RH loggers, point maps, contour/heat maps, air-movement observation, CO2/IAQ caveat, surface temperature, optional globe/SMART-style radiant proxy, sampling bias.</w:t>
             </w:r>
           </w:p>
         </w:tc>
@@ -962,7 +962,7 @@
               <w:pStyle w:val="Compact"/>
             </w:pPr>
             <w:r>
-              <w:t xml:space="preserve">Why same air temperature can produce different thermal experience; solar wattage, sky/surface source-sink logic, surface temperature, solar exposure, longwave/shortwave radiation, MRT, operative temperature, shade as architecture. Diagnostic round: locate radiant hot/cold positions.</w:t>
+              <w:t xml:space="preserve">Why same air temperature can produce different thermal experience; solar wattage, sky/surface source-sink logic, reflectivity/albedo, absorptivity, emissivity, surface temperature, solar exposure, longwave/shortwave radiation, MRT, operative temperature, shade as architecture. Diagnostic round: locate radiant hot/cold positions.</w:t>
             </w:r>
           </w:p>
         </w:tc>
@@ -984,7 +984,7 @@
               <w:pStyle w:val="Compact"/>
             </w:pPr>
             <w:r>
-              <w:t xml:space="preserve">Solar and sky radiation, surface temperature, MRT, operative temperature, indoor/outdoor radiant fields.</w:t>
+              <w:t xml:space="preserve">Solar and sky radiation, reflectivity/albedo, absorptivity, emissivity, surface temperature, MRT, operative temperature, indoor/outdoor radiant fields.</w:t>
             </w:r>
           </w:p>
         </w:tc>
@@ -1019,18 +1019,18 @@
               <w:pStyle w:val="Compact"/>
             </w:pPr>
             <w:r>
-              <w:t xml:space="preserve">How body geometry, orientation, view factors, glass, shade, pavement, indoor daytime variation, night-sky cooling, urban heat-island recovery, and facade depth deliver uneven radiant flux. Diagnostic round: assess whether the design mitigation changes the actual exposure pathway.</w:t>
-            </w:r>
-          </w:p>
-        </w:tc>
-        <w:tc>
-          <w:tcPr/>
-          <w:p>
-            <w:pPr>
-              <w:pStyle w:val="Compact"/>
-            </w:pPr>
-            <w:r>
-              <w:t xml:space="preserve">Submit A2 radiant exchange card with two-position comparison, body orientation, source/sink note, and design implication.</w:t>
+              <w:t xml:space="preserve">How body geometry, orientation, view factors, glass, shade, pavement, material-property levers, indoor daytime variation, night-sky cooling, urban heat-island recovery, and facade depth deliver uneven radiant flux. Diagnostic round: assess whether the design mitigation changes the actual exposure pathway.</w:t>
+            </w:r>
+          </w:p>
+        </w:tc>
+        <w:tc>
+          <w:tcPr/>
+          <w:p>
+            <w:pPr>
+              <w:pStyle w:val="Compact"/>
+            </w:pPr>
+            <w:r>
+              <w:t xml:space="preserve">Submit A2 radiant exchange card with two-position comparison, body orientation, source/sink note, material-property note, and design implication.</w:t>
             </w:r>
           </w:p>
         </w:tc>
@@ -1076,7 +1076,7 @@
               <w:pStyle w:val="Compact"/>
             </w:pPr>
             <w:r>
-              <w:t xml:space="preserve">Heat capacity, thermal lag, storage, degree-hours, thresholds, condensation, mold risk, material moisture storage, and why failure can be cumulative. Includes anonymous Week 6 course-alignment pulse check. Diagnostic round: identify when heat or moisture accumulates.</w:t>
+              <w:t xml:space="preserve">Heat capacity, thermal lag, storage, optical/radiant surface properties, degree-hours, thresholds, condensation, mold risk, material moisture storage, and why failure can be cumulative. Includes anonymous Week 6 course-alignment pulse check. Diagnostic round: identify when heat or moisture accumulates.</w:t>
             </w:r>
           </w:p>
         </w:tc>
@@ -1116,7 +1116,7 @@
               <w:t xml:space="preserve">C dT/dt = gains - losses</w:t>
             </w:r>
             <w:r>
-              <w:t xml:space="preserve">, degree-hours, thresholds, material moisture.</w:t>
+              <w:t xml:space="preserve">, degree-hours, thresholds, material moisture, surface storage/release.</w:t>
             </w:r>
           </w:p>
         </w:tc>
@@ -1208,7 +1208,7 @@
               <w:pStyle w:val="Compact"/>
             </w:pPr>
             <w:r>
-              <w:t xml:space="preserve">Weather files, typical year versus heatwave period, future weather, GCM/RCM/WRF concepts, spatial resolution, stress windows, climate-zone drift, and indoor/outdoor continuity. Diagnostic round: how would the design behave under a different weather slice or climate snapshot?</w:t>
+              <w:t xml:space="preserve">Weather files, typical year versus heatwave period, future weather, GCM/RCM/WRF concepts, spatial resolution, Local Climate Zones (LCZ), stress windows, climate-zone drift, and indoor/outdoor continuity. Diagnostic round: how would the design behave under a different weather slice or climate snapshot?</w:t>
             </w:r>
           </w:p>
         </w:tc>
@@ -1230,7 +1230,7 @@
               <w:pStyle w:val="Compact"/>
             </w:pPr>
             <w:r>
-              <w:t xml:space="preserve">EPW/TMY, heatwave windows, future weather, GCM/RCM/WRF, spatial resolution, climate-zone drift, climate-stress reading.</w:t>
+              <w:t xml:space="preserve">EPW/TMY, heatwave windows, future weather, GCM/RCM/WRF, spatial resolution, LCZ, climate-zone drift, climate-stress reading.</w:t>
             </w:r>
           </w:p>
         </w:tc>
@@ -1821,7 +1821,7 @@
               <w:pStyle w:val="Compact"/>
             </w:pPr>
             <w:r>
-              <w:t xml:space="preserve">Two-position radiant comparison; body orientation; relevant surface temperatures or radiant proxy; dominant source/sink note using solar wattage, surface temperature, MRT difference, or operative-temperature contribution where possible; air-versus-radiant distinction; one architectural implication.</w:t>
+              <w:t xml:space="preserve">Two-position radiant comparison; body orientation; relevant surface temperatures or radiant proxy; dominant source/sink note using solar wattage, surface temperature, MRT difference, or operative-temperature contribution where possible; material-property note where relevant, including reflectivity/albedo, absorptivity, emissivity, thermal capacity, or glazing transmittance; air-versus-radiant distinction; one architectural implication.</w:t>
             </w:r>
           </w:p>
         </w:tc>
@@ -1868,7 +1868,7 @@
               <w:pStyle w:val="Compact"/>
             </w:pPr>
             <w:r>
-              <w:t xml:space="preserve">Time-series or hourly output; system boundary box; selected threshold; degree-hour or exceedance calculation; baseline and changed weather/exposure/climate snapshot; failure statement; explanation of thermal capacity, lag, moisture, or exposure duration.</w:t>
+              <w:t xml:space="preserve">Time-series or hourly output; system boundary box; selected threshold; degree-hour or exceedance calculation; baseline and changed weather/exposure/climate snapshot; failure statement; explanation of thermal capacity, surface storage/release, lag, moisture, or exposure duration.</w:t>
             </w:r>
           </w:p>
         </w:tc>

</xml_diff>